<commit_message>
docs: humanize and verify technical dossier
</commit_message>
<xml_diff>
--- a/deliverables/inclusive-credit-system-design-package/Inclusive_Credit_Platform_Technical_Dossier.docx
+++ b/deliverables/inclusive-credit-system-design-package/Inclusive_Credit_Platform_Technical_Dossier.docx
@@ -67,7 +67,7 @@
           <w:color w:val="1B365D"/>
           <w:sz w:val="20"/>
         </w:rPr>
-        <w:t xml:space="preserve">Repository: </w:t>
+        <w:t xml:space="preserve">Prepared by: </w:t>
       </w:r>
       <w:r>
         <w:rPr>
@@ -77,7 +77,7 @@
           <w:color w:val="505A69"/>
           <w:sz w:val="20"/>
         </w:rPr>
-        <w:t>credit-evaluation-platform</w:t>
+        <w:t>Mr. Wang</w:t>
       </w:r>
     </w:p>
     <w:p>
@@ -92,7 +92,7 @@
           <w:color w:val="1B365D"/>
           <w:sz w:val="20"/>
         </w:rPr>
-        <w:t xml:space="preserve">Edition: </w:t>
+        <w:t xml:space="preserve">Repository: </w:t>
       </w:r>
       <w:r>
         <w:rPr>
@@ -102,7 +102,7 @@
           <w:color w:val="505A69"/>
           <w:sz w:val="20"/>
         </w:rPr>
-        <w:t>Submission-ready consolidated technical evidence edition</w:t>
+        <w:t>credit-evaluation-platform</w:t>
       </w:r>
     </w:p>
     <w:p>
@@ -117,7 +117,7 @@
           <w:color w:val="1B365D"/>
           <w:sz w:val="20"/>
         </w:rPr>
-        <w:t xml:space="preserve">Evidence status: </w:t>
+        <w:t xml:space="preserve">Document purpose: </w:t>
       </w:r>
       <w:r>
         <w:rPr>
@@ -127,6 +127,31 @@
           <w:color w:val="505A69"/>
           <w:sz w:val="20"/>
         </w:rPr>
+        <w:t>Technical review and implementation evidence</w:t>
+      </w:r>
+    </w:p>
+    <w:p>
+      <w:pPr>
+        <w:jc w:val="center"/>
+      </w:pPr>
+      <w:r>
+        <w:rPr>
+          <w:rFonts w:ascii="Calibri" w:hAnsi="Calibri"/>
+          <w:b/>
+          <w:i w:val="0"/>
+          <w:color w:val="1B365D"/>
+          <w:sz w:val="20"/>
+        </w:rPr>
+        <w:t xml:space="preserve">Evidence status: </w:t>
+      </w:r>
+      <w:r>
+        <w:rPr>
+          <w:rFonts w:ascii="Calibri" w:hAnsi="Calibri"/>
+          <w:b w:val="0"/>
+          <w:i w:val="0"/>
+          <w:color w:val="505A69"/>
+          <w:sz w:val="20"/>
+        </w:rPr>
         <w:t>Reference implementation; synthetic-data demonstration; not production approved</w:t>
       </w:r>
     </w:p>
@@ -405,7 +430,7 @@
           <w:i w:val="0"/>
           <w:sz w:val="21"/>
         </w:rPr>
-        <w:t>Implemented claims are separated from scaffolding and planned capabilities. This dossier does not treat roadmap commitments as completed work.</w:t>
+        <w:t>Implemented work, partial scaffolding, and planned controls are labeled separately throughout the dossier.</w:t>
       </w:r>
     </w:p>
     <w:p>
@@ -437,7 +462,7 @@
           <w:i w:val="0"/>
           <w:sz w:val="21"/>
         </w:rPr>
-        <w:t xml:space="preserve">Repository assessed: </w:t>
+        <w:t xml:space="preserve">Repository reviewed: </w:t>
       </w:r>
       <w:r>
         <w:rPr>
@@ -447,7 +472,7 @@
           <w:color w:val="1B365D"/>
           <w:sz w:val="18"/>
         </w:rPr>
-        <w:t>/Users/andy/credit-evaluation-platform</w:t>
+        <w:t>credit-evaluation-platform</w:t>
       </w:r>
     </w:p>
     <w:p>
@@ -473,7 +498,7 @@
           <w:i w:val="0"/>
           <w:sz w:val="21"/>
         </w:rPr>
-        <w:t>This folder is a consolidated, audit-oriented description of the open-source alternative-data credit modeling framework and the real-time responsible-AI platform described in Mr. Wang's project plan. It documents the architecture, technical specifications, implemented components, model-development and testing approach, fairness and bias controls, and evidence currently available in the repository.</w:t>
+        <w:t>This dossier records the engineering work completed to date for the two linked initiatives in Mr. Wang's project plan: an open-source alternative-data credit evaluation framework and a real-time decision-support platform with continuous governance. It covers the architecture, technical specifications, implemented components, model-development work, fairness testing, and repository evidence. The project plan identifies the Fair Credit Reporting Act and the Equal Credit Opportunity Act as relevant review frameworks; this dossier documents technical controls and does not offer a legal-compliance conclusion.</w:t>
       </w:r>
     </w:p>
     <w:p>
@@ -591,7 +616,7 @@
           <w:i w:val="0"/>
           <w:sz w:val="21"/>
         </w:rPr>
-        <w:t>The package deliberately avoids treating roadmap commitments as completed work. The current repository is a reference implementation and synthetic-data demonstration, not a production-approved lending system.</w:t>
+        <w:t>Throughout the dossier, planned controls are kept separate from finished work. The repository is a reference implementation and synthetic-data demonstration, not a production-approved lending system.</w:t>
       </w:r>
     </w:p>
     <w:p>
@@ -858,7 +883,7 @@
           <w:i w:val="0"/>
           <w:sz w:val="21"/>
         </w:rPr>
-        <w:t xml:space="preserve"> — live UI evidence, operator procedure, interpretation rules, and mock-mode limitations.</w:t>
+        <w:t xml:space="preserve"> — local UI evidence, operator procedure, interpretation rules, and mock-mode limitations.</w:t>
       </w:r>
     </w:p>
     <w:p>
@@ -942,7 +967,7 @@
           <w:i w:val="0"/>
           <w:sz w:val="21"/>
         </w:rPr>
-        <w:t xml:space="preserve"> — twelve live mock-mode product captures covering the complete demonstration workflow.</w:t>
+        <w:t xml:space="preserve"> — twelve local mock-mode product captures covering the complete demonstration workflow.</w:t>
       </w:r>
     </w:p>
     <w:p>
@@ -1024,7 +1049,7 @@
           <w:i w:val="0"/>
           <w:sz w:val="21"/>
         </w:rPr>
-        <w:t xml:space="preserve">The repository demonstrates a credible early reference architecture: alternative-data feature contracts; synthetic-data training; logistic-regression scoring; reason-code generation; subgroup fairness metrics; model registry metadata; JSONL/SQLite audit primitives; FastAPI endpoints; privacy redaction; and a React demonstration console. The current automated suite completed ten tests successfully and exposed one governance-oracle mismatch: the end-to-end test expects an overall </w:t>
+        <w:t xml:space="preserve">The working core is concrete: alternative-data feature definitions, synthetic-data training, logistic-regression scoring, reason-code generation, subgroup fairness metrics, model-registry metadata, JSONL/SQLite audit primitives, FastAPI endpoints, privacy-redaction utilities, and a React demonstration console. Ten of the eleven automated tests passed. The remaining test expects the governance summary to report </w:t>
       </w:r>
       <w:r>
         <w:rPr>
@@ -1043,7 +1068,7 @@
           <w:i w:val="0"/>
           <w:sz w:val="21"/>
         </w:rPr>
-        <w:t xml:space="preserve"> state, while the implemented fairness control correctly returns </w:t>
+        <w:t xml:space="preserve">; the service reports </w:t>
       </w:r>
       <w:r>
         <w:rPr>
@@ -1062,18 +1087,18 @@
           <w:i w:val="0"/>
           <w:sz w:val="21"/>
         </w:rPr>
-        <w:t xml:space="preserve"> for the deliberately imbalanced demonstration cohort. The frontend production bundle completed successfully under the bundled Node 24 runtime.</w:t>
-      </w:r>
-    </w:p>
-    <w:p>
-      <w:r>
-        <w:rPr>
-          <w:rFonts w:ascii="Calibri" w:hAnsi="Calibri"/>
-          <w:b w:val="0"/>
-          <w:i w:val="0"/>
-          <w:sz w:val="21"/>
-        </w:rPr>
-        <w:t>The strongest evidence is engineering scaffolding and end-to-end integration. The most important limitations are synthetic-only data, modest baseline discrimination (ROC-AUC 0.56588288 in the evidence run), a convergence warning at 200 iterations, no independent validation, no production authentication/authorization proof, no tamper-evident audit sealing, no verified live lender pilot, and no legally approved adverse-action mapping. These limitations are appropriate for a demo but must be closed before consequential credit use.</w:t>
+        <w:t xml:space="preserve"> because the supplied fairness rows exceed its 0.10 disparity thresholds. That test expectation still needs to be reconciled with the implemented policy. The frontend production bundle completed successfully with the bundled Node 24 runtime.</w:t>
+      </w:r>
+    </w:p>
+    <w:p>
+      <w:r>
+        <w:rPr>
+          <w:rFonts w:ascii="Calibri" w:hAnsi="Calibri"/>
+          <w:b w:val="0"/>
+          <w:i w:val="0"/>
+          <w:sz w:val="21"/>
+        </w:rPr>
+        <w:t>What the repository proves best is that the main pieces can be connected and exercised end to end. It does not yet prove that the model is fit for lending. The evidence run used synthetic data, produced a ROC-AUC of 0.56588288, and ended with a convergence warning at 200 iterations. Independent validation, production identity and authorization, tamper-evident audit storage, a lender pilot, and approved borrower-notice language also remain open. Those gaps must be closed before the system is used for a consequential credit decision.</w:t>
       </w:r>
     </w:p>
     <w:p>
@@ -1172,7 +1197,7 @@
           <w:i w:val="0"/>
           <w:sz w:val="21"/>
         </w:rPr>
-        <w:t>The platform is designed to help regulated or mission-driven lenders evaluate thin-file and credit-invisible applicants using consumer-permissioned alternative data, while preserving explainability, fairness measurement, auditability, and human oversight. It has two architectural planes:</w:t>
+        <w:t>This work joins two related systems: an offline framework for developing and reviewing alternative-data models, and an online service for using an approved model in a lender workflow. The design is aimed at thin-file and credit-invisible applicants and assumes consumer-permissioned data, explainability, fairness measurement, auditability, and human oversight. It has two architectural planes:</w:t>
       </w:r>
     </w:p>
     <w:p>
@@ -1614,7 +1639,7 @@
           <w:i w:val="0"/>
           <w:sz w:val="21"/>
         </w:rPr>
-        <w:t>Pydantic request schemas reject malformed or unexpected fields.</w:t>
+        <w:t>Pydantic validates the declared field types and required request fields. The feature contract rejects missing and unknown feature names and rejects non-numeric values. The current request models do not forbid every unknown top-level field.</w:t>
       </w:r>
     </w:p>
     <w:p>
@@ -1632,7 +1657,26 @@
           <w:i w:val="0"/>
           <w:sz w:val="21"/>
         </w:rPr>
-        <w:t>The feature-contract layer validates ranges, missingness, names, and ordering, then transforms the payload into the model vector.</w:t>
+        <w:t xml:space="preserve">The feature layer orders values for the model and applies minimal sanitization: payment rates are clamped to </w:t>
+      </w:r>
+      <w:r>
+        <w:rPr>
+          <w:rFonts w:ascii="Courier New" w:hAnsi="Courier New"/>
+          <w:b w:val="0"/>
+          <w:i w:val="0"/>
+          <w:color w:val="1B365D"/>
+          <w:sz w:val="18"/>
+        </w:rPr>
+        <w:t>[0, 1]</w:t>
+      </w:r>
+      <w:r>
+        <w:rPr>
+          <w:rFonts w:ascii="Calibri" w:hAnsi="Calibri"/>
+          <w:b w:val="0"/>
+          <w:i w:val="0"/>
+          <w:sz w:val="21"/>
+        </w:rPr>
+        <w:t>, and negative NSF or overdraft counts are clamped to zero. The API publishes broader range metadata for the UI, but complete server-side enforcement of those bounds remains open work.</w:t>
       </w:r>
     </w:p>
     <w:p>
@@ -2036,7 +2080,7 @@
           <w:i w:val="0"/>
           <w:sz w:val="21"/>
         </w:rPr>
-        <w:t>React/Vite frontend at port 5173.</w:t>
+        <w:t>React/Vite frontend on a Vite-selected local port; the captured review session used port 4173.</w:t>
       </w:r>
     </w:p>
     <w:p>
@@ -2568,6 +2612,7 @@
       <w:tr>
         <w:trPr>
           <w:tblHeader w:val="true"/>
+          <w:cantSplit w:val="true"/>
         </w:trPr>
         <w:tc>
           <w:tcPr>
@@ -2655,6 +2700,9 @@
         </w:tc>
       </w:tr>
       <w:tr>
+        <w:trPr>
+          <w:cantSplit w:val="true"/>
+        </w:trPr>
         <w:tc>
           <w:tcPr>
             <w:tcW w:type="dxa" w:w="3235"/>
@@ -2735,6 +2783,9 @@
         </w:tc>
       </w:tr>
       <w:tr>
+        <w:trPr>
+          <w:cantSplit w:val="true"/>
+        </w:trPr>
         <w:tc>
           <w:tcPr>
             <w:tcW w:type="dxa" w:w="3235"/>
@@ -2815,6 +2866,9 @@
         </w:tc>
       </w:tr>
       <w:tr>
+        <w:trPr>
+          <w:cantSplit w:val="true"/>
+        </w:trPr>
         <w:tc>
           <w:tcPr>
             <w:tcW w:type="dxa" w:w="3235"/>
@@ -2895,6 +2949,9 @@
         </w:tc>
       </w:tr>
       <w:tr>
+        <w:trPr>
+          <w:cantSplit w:val="true"/>
+        </w:trPr>
         <w:tc>
           <w:tcPr>
             <w:tcW w:type="dxa" w:w="3235"/>
@@ -2975,6 +3032,9 @@
         </w:tc>
       </w:tr>
       <w:tr>
+        <w:trPr>
+          <w:cantSplit w:val="true"/>
+        </w:trPr>
         <w:tc>
           <w:tcPr>
             <w:tcW w:type="dxa" w:w="3235"/>
@@ -3055,6 +3115,9 @@
         </w:tc>
       </w:tr>
       <w:tr>
+        <w:trPr>
+          <w:cantSplit w:val="true"/>
+        </w:trPr>
         <w:tc>
           <w:tcPr>
             <w:tcW w:type="dxa" w:w="3235"/>
@@ -3135,6 +3198,9 @@
         </w:tc>
       </w:tr>
       <w:tr>
+        <w:trPr>
+          <w:cantSplit w:val="true"/>
+        </w:trPr>
         <w:tc>
           <w:tcPr>
             <w:tcW w:type="dxa" w:w="3235"/>
@@ -3298,6 +3364,7 @@
       <w:tr>
         <w:trPr>
           <w:tblHeader w:val="true"/>
+          <w:cantSplit w:val="true"/>
         </w:trPr>
         <w:tc>
           <w:tcPr>
@@ -3385,6 +3452,9 @@
         </w:tc>
       </w:tr>
       <w:tr>
+        <w:trPr>
+          <w:cantSplit w:val="true"/>
+        </w:trPr>
         <w:tc>
           <w:tcPr>
             <w:tcW w:type="dxa" w:w="3235"/>
@@ -3465,6 +3535,9 @@
         </w:tc>
       </w:tr>
       <w:tr>
+        <w:trPr>
+          <w:cantSplit w:val="true"/>
+        </w:trPr>
         <w:tc>
           <w:tcPr>
             <w:tcW w:type="dxa" w:w="3235"/>
@@ -3545,6 +3618,9 @@
         </w:tc>
       </w:tr>
       <w:tr>
+        <w:trPr>
+          <w:cantSplit w:val="true"/>
+        </w:trPr>
         <w:tc>
           <w:tcPr>
             <w:tcW w:type="dxa" w:w="3235"/>
@@ -3625,6 +3701,9 @@
         </w:tc>
       </w:tr>
       <w:tr>
+        <w:trPr>
+          <w:cantSplit w:val="true"/>
+        </w:trPr>
         <w:tc>
           <w:tcPr>
             <w:tcW w:type="dxa" w:w="3235"/>
@@ -3705,6 +3784,9 @@
         </w:tc>
       </w:tr>
       <w:tr>
+        <w:trPr>
+          <w:cantSplit w:val="true"/>
+        </w:trPr>
         <w:tc>
           <w:tcPr>
             <w:tcW w:type="dxa" w:w="3235"/>
@@ -3785,6 +3867,9 @@
         </w:tc>
       </w:tr>
       <w:tr>
+        <w:trPr>
+          <w:cantSplit w:val="true"/>
+        </w:trPr>
         <w:tc>
           <w:tcPr>
             <w:tcW w:type="dxa" w:w="3235"/>
@@ -3865,6 +3950,9 @@
         </w:tc>
       </w:tr>
       <w:tr>
+        <w:trPr>
+          <w:cantSplit w:val="true"/>
+        </w:trPr>
         <w:tc>
           <w:tcPr>
             <w:tcW w:type="dxa" w:w="3235"/>
@@ -3945,6 +4033,9 @@
         </w:tc>
       </w:tr>
       <w:tr>
+        <w:trPr>
+          <w:cantSplit w:val="true"/>
+        </w:trPr>
         <w:tc>
           <w:tcPr>
             <w:tcW w:type="dxa" w:w="3235"/>
@@ -4076,6 +4167,7 @@
       <w:tr>
         <w:trPr>
           <w:tblHeader w:val="true"/>
+          <w:cantSplit w:val="true"/>
         </w:trPr>
         <w:tc>
           <w:tcPr>
@@ -4163,6 +4255,9 @@
         </w:tc>
       </w:tr>
       <w:tr>
+        <w:trPr>
+          <w:cantSplit w:val="true"/>
+        </w:trPr>
         <w:tc>
           <w:tcPr>
             <w:tcW w:type="dxa" w:w="3235"/>
@@ -4244,6 +4339,9 @@
         </w:tc>
       </w:tr>
       <w:tr>
+        <w:trPr>
+          <w:cantSplit w:val="true"/>
+        </w:trPr>
         <w:tc>
           <w:tcPr>
             <w:tcW w:type="dxa" w:w="3235"/>
@@ -4325,6 +4423,9 @@
         </w:tc>
       </w:tr>
       <w:tr>
+        <w:trPr>
+          <w:cantSplit w:val="true"/>
+        </w:trPr>
         <w:tc>
           <w:tcPr>
             <w:tcW w:type="dxa" w:w="3235"/>
@@ -4406,6 +4507,9 @@
         </w:tc>
       </w:tr>
       <w:tr>
+        <w:trPr>
+          <w:cantSplit w:val="true"/>
+        </w:trPr>
         <w:tc>
           <w:tcPr>
             <w:tcW w:type="dxa" w:w="3235"/>
@@ -4487,6 +4591,9 @@
         </w:tc>
       </w:tr>
       <w:tr>
+        <w:trPr>
+          <w:cantSplit w:val="true"/>
+        </w:trPr>
         <w:tc>
           <w:tcPr>
             <w:tcW w:type="dxa" w:w="3235"/>
@@ -4568,6 +4675,9 @@
         </w:tc>
       </w:tr>
       <w:tr>
+        <w:trPr>
+          <w:cantSplit w:val="true"/>
+        </w:trPr>
         <w:tc>
           <w:tcPr>
             <w:tcW w:type="dxa" w:w="3235"/>
@@ -4649,6 +4759,9 @@
         </w:tc>
       </w:tr>
       <w:tr>
+        <w:trPr>
+          <w:cantSplit w:val="true"/>
+        </w:trPr>
         <w:tc>
           <w:tcPr>
             <w:tcW w:type="dxa" w:w="3235"/>
@@ -4730,6 +4843,9 @@
         </w:tc>
       </w:tr>
       <w:tr>
+        <w:trPr>
+          <w:cantSplit w:val="true"/>
+        </w:trPr>
         <w:tc>
           <w:tcPr>
             <w:tcW w:type="dxa" w:w="3235"/>
@@ -5042,7 +5158,7 @@
           <w:color w:val="1B365D"/>
           <w:sz w:val="23"/>
         </w:rPr>
-        <w:t>HTTP behavior</w:t>
+        <w:t>Target HTTP behavior</w:t>
       </w:r>
     </w:p>
     <w:p>
@@ -5180,7 +5296,7 @@
           <w:i w:val="0"/>
           <w:sz w:val="21"/>
         </w:rPr>
-        <w:t xml:space="preserve"> approved model or required audit dependency unavailable.</w:t>
+        <w:t xml:space="preserve"> approved model or required audit dependency unavailable. The reference service implements only part of this status model; gateway, tenant-authorization, version-conflict, and rate-limit behavior are production requirements.</w:t>
       </w:r>
     </w:p>
     <w:p>
@@ -5234,7 +5350,7 @@
           <w:i w:val="0"/>
           <w:sz w:val="21"/>
         </w:rPr>
-        <w:t>Each feature definition should specify name, type, units, allowed range, missing-value policy, source, lookback window, transform, monotonic expectation, data-quality rules, consumer-consent basis, and reason-code mapping. The current code publishes and validates named alternative-data features and provides a schema hash.</w:t>
+        <w:t>Each feature definition should specify name, type, units, allowed range, missing-value policy, source, lookback window, transform, monotonic expectation, data-quality rules, consumer-consent basis, and reason-code mapping. The current core contract enforces required and optional names, numeric types, ordering, and a schema hash. Separate API metadata supplies labels and control ranges to the frontend. Those published ranges are not yet a complete backend validation contract: the scoring path performs limited clamping for payment rates and event counts but does not reject every out-of-range value.</w:t>
       </w:r>
     </w:p>
     <w:p>
@@ -5646,6 +5762,7 @@
       <w:tr>
         <w:trPr>
           <w:tblHeader w:val="true"/>
+          <w:cantSplit w:val="true"/>
         </w:trPr>
         <w:tc>
           <w:tcPr>
@@ -5705,6 +5822,9 @@
         </w:tc>
       </w:tr>
       <w:tr>
+        <w:trPr>
+          <w:cantSplit w:val="true"/>
+        </w:trPr>
         <w:tc>
           <w:tcPr>
             <w:tcW w:type="dxa" w:w="4853"/>
@@ -5759,6 +5879,9 @@
         </w:tc>
       </w:tr>
       <w:tr>
+        <w:trPr>
+          <w:cantSplit w:val="true"/>
+        </w:trPr>
         <w:tc>
           <w:tcPr>
             <w:tcW w:type="dxa" w:w="4853"/>
@@ -5813,6 +5936,9 @@
         </w:tc>
       </w:tr>
       <w:tr>
+        <w:trPr>
+          <w:cantSplit w:val="true"/>
+        </w:trPr>
         <w:tc>
           <w:tcPr>
             <w:tcW w:type="dxa" w:w="4853"/>
@@ -5867,6 +5993,9 @@
         </w:tc>
       </w:tr>
       <w:tr>
+        <w:trPr>
+          <w:cantSplit w:val="true"/>
+        </w:trPr>
         <w:tc>
           <w:tcPr>
             <w:tcW w:type="dxa" w:w="4853"/>
@@ -5921,6 +6050,9 @@
         </w:tc>
       </w:tr>
       <w:tr>
+        <w:trPr>
+          <w:cantSplit w:val="true"/>
+        </w:trPr>
         <w:tc>
           <w:tcPr>
             <w:tcW w:type="dxa" w:w="4853"/>
@@ -5975,6 +6107,9 @@
         </w:tc>
       </w:tr>
       <w:tr>
+        <w:trPr>
+          <w:cantSplit w:val="true"/>
+        </w:trPr>
         <w:tc>
           <w:tcPr>
             <w:tcW w:type="dxa" w:w="4853"/>
@@ -6029,6 +6164,9 @@
         </w:tc>
       </w:tr>
       <w:tr>
+        <w:trPr>
+          <w:cantSplit w:val="true"/>
+        </w:trPr>
         <w:tc>
           <w:tcPr>
             <w:tcW w:type="dxa" w:w="4853"/>
@@ -6083,6 +6221,9 @@
         </w:tc>
       </w:tr>
       <w:tr>
+        <w:trPr>
+          <w:cantSplit w:val="true"/>
+        </w:trPr>
         <w:tc>
           <w:tcPr>
             <w:tcW w:type="dxa" w:w="4853"/>
@@ -6137,6 +6278,9 @@
         </w:tc>
       </w:tr>
       <w:tr>
+        <w:trPr>
+          <w:cantSplit w:val="true"/>
+        </w:trPr>
         <w:tc>
           <w:tcPr>
             <w:tcW w:type="dxa" w:w="4853"/>
@@ -6191,6 +6335,9 @@
         </w:tc>
       </w:tr>
       <w:tr>
+        <w:trPr>
+          <w:cantSplit w:val="true"/>
+        </w:trPr>
         <w:tc>
           <w:tcPr>
             <w:tcW w:type="dxa" w:w="4853"/>
@@ -6245,6 +6392,9 @@
         </w:tc>
       </w:tr>
       <w:tr>
+        <w:trPr>
+          <w:cantSplit w:val="true"/>
+        </w:trPr>
         <w:tc>
           <w:tcPr>
             <w:tcW w:type="dxa" w:w="4853"/>
@@ -7536,7 +7686,7 @@
           <w:i w:val="0"/>
           <w:sz w:val="21"/>
         </w:rPr>
-        <w:t xml:space="preserve"> define accepted feature names, types, bounds, ordering, and transformation into model inputs.</w:t>
+        <w:t xml:space="preserve"> define accepted feature names, required/optional status, numeric types, ordering, schema hash, and transformation into model inputs; publish richer display metadata through the API.</w:t>
       </w:r>
     </w:p>
     <w:p>
@@ -7576,7 +7726,7 @@
           <w:i w:val="0"/>
           <w:sz w:val="21"/>
         </w:rPr>
-        <w:t xml:space="preserve"> implemented and tested through contract publication and scoring.</w:t>
+        <w:t xml:space="preserve"> name/type/order enforcement and contract publication are implemented and tested. UI range metadata is implemented, but complete server-side range enforcement is not.</w:t>
       </w:r>
     </w:p>
     <w:p>
@@ -9398,7 +9548,26 @@
           <w:i w:val="0"/>
           <w:sz w:val="21"/>
         </w:rPr>
-        <w:t xml:space="preserve"> implemented and exercised in mock mode. The local Vite server was opened through the in-app browser, and twelve views covering landing status, feature input, scoring, borrower rights, explanation, fairness, portfolio analysis, outcomes, governance lineage, monitoring, and control evidence were captured in </w:t>
+        <w:t xml:space="preserve"> implemented and exercised in mock mode. The mock adapter uses typed fixtures for model, contract, fairness, governance, portfolio, and audit views, while generating some score, decision, request-ID, and </w:t>
+      </w:r>
+      <w:r>
+        <w:rPr>
+          <w:rFonts w:ascii="Courier New" w:hAnsi="Courier New"/>
+          <w:b w:val="0"/>
+          <w:i w:val="0"/>
+          <w:color w:val="1B365D"/>
+          <w:sz w:val="18"/>
+        </w:rPr>
+        <w:t>created_at</w:t>
+      </w:r>
+      <w:r>
+        <w:rPr>
+          <w:rFonts w:ascii="Calibri" w:hAnsi="Calibri"/>
+          <w:b w:val="0"/>
+          <w:i w:val="0"/>
+          <w:sz w:val="21"/>
+        </w:rPr>
+        <w:t xml:space="preserve"> values at runtime. The local Vite application was opened through the in-app browser, and twelve views covering landing status, feature input, scoring, borrower rights, explanation, fairness, portfolio analysis, outcomes, governance lineage, monitoring, and control evidence were captured in </w:t>
       </w:r>
       <w:r>
         <w:rPr>
@@ -9862,6 +10031,7 @@
       <w:tr>
         <w:trPr>
           <w:tblHeader w:val="true"/>
+          <w:cantSplit w:val="true"/>
         </w:trPr>
         <w:tc>
           <w:tcPr>
@@ -9977,6 +10147,9 @@
         </w:tc>
       </w:tr>
       <w:tr>
+        <w:trPr>
+          <w:cantSplit w:val="true"/>
+        </w:trPr>
         <w:tc>
           <w:tcPr>
             <w:tcW w:type="dxa" w:w="2426"/>
@@ -10083,6 +10256,9 @@
         </w:tc>
       </w:tr>
       <w:tr>
+        <w:trPr>
+          <w:cantSplit w:val="true"/>
+        </w:trPr>
         <w:tc>
           <w:tcPr>
             <w:tcW w:type="dxa" w:w="2426"/>
@@ -10189,6 +10365,9 @@
         </w:tc>
       </w:tr>
       <w:tr>
+        <w:trPr>
+          <w:cantSplit w:val="true"/>
+        </w:trPr>
         <w:tc>
           <w:tcPr>
             <w:tcW w:type="dxa" w:w="2426"/>
@@ -10295,6 +10474,9 @@
         </w:tc>
       </w:tr>
       <w:tr>
+        <w:trPr>
+          <w:cantSplit w:val="true"/>
+        </w:trPr>
         <w:tc>
           <w:tcPr>
             <w:tcW w:type="dxa" w:w="2426"/>
@@ -10401,6 +10583,9 @@
         </w:tc>
       </w:tr>
       <w:tr>
+        <w:trPr>
+          <w:cantSplit w:val="true"/>
+        </w:trPr>
         <w:tc>
           <w:tcPr>
             <w:tcW w:type="dxa" w:w="2426"/>
@@ -10507,6 +10692,9 @@
         </w:tc>
       </w:tr>
       <w:tr>
+        <w:trPr>
+          <w:cantSplit w:val="true"/>
+        </w:trPr>
         <w:tc>
           <w:tcPr>
             <w:tcW w:type="dxa" w:w="2426"/>
@@ -10613,6 +10801,9 @@
         </w:tc>
       </w:tr>
       <w:tr>
+        <w:trPr>
+          <w:cantSplit w:val="true"/>
+        </w:trPr>
         <w:tc>
           <w:tcPr>
             <w:tcW w:type="dxa" w:w="2426"/>
@@ -10719,6 +10910,9 @@
         </w:tc>
       </w:tr>
       <w:tr>
+        <w:trPr>
+          <w:cantSplit w:val="true"/>
+        </w:trPr>
         <w:tc>
           <w:tcPr>
             <w:tcW w:type="dxa" w:w="2426"/>
@@ -11989,7 +12183,7 @@
           <w:i w:val="0"/>
           <w:sz w:val="21"/>
         </w:rPr>
-        <w:t xml:space="preserve">. The failure is a governance-oracle mismatch in </w:t>
+        <w:t xml:space="preserve">. The failure is a test-expectation mismatch in </w:t>
       </w:r>
       <w:r>
         <w:rPr>
@@ -12027,7 +12221,7 @@
           <w:i w:val="0"/>
           <w:sz w:val="21"/>
         </w:rPr>
-        <w:t xml:space="preserve">, but the implemented governance service returns </w:t>
+        <w:t xml:space="preserve">, but the governance service returns </w:t>
       </w:r>
       <w:r>
         <w:rPr>
@@ -12046,7 +12240,7 @@
           <w:i w:val="0"/>
           <w:sz w:val="21"/>
         </w:rPr>
-        <w:t xml:space="preserve"> because the demonstration fairness report breaches its disparity thresholds. This conservative runtime disposition is consistent with the control logic; the test expectation and approved policy behavior must be reconciled before the suite can be represented as fully passing. The same flow emitted a scikit-learn convergence warning after reaching </w:t>
+        <w:t xml:space="preserve"> because the supplied fairness rows exceed the configured 0.10 parity and opportunity thresholds. The implementation and the test must be brought into agreement before the suite can be described as passing. The same flow emitted a scikit-learn convergence warning after reaching </w:t>
       </w:r>
       <w:r>
         <w:rPr>
@@ -12548,6 +12742,7 @@
       <w:tr>
         <w:trPr>
           <w:tblHeader w:val="true"/>
+          <w:cantSplit w:val="true"/>
         </w:trPr>
         <w:tc>
           <w:tcPr>
@@ -12635,6 +12830,9 @@
         </w:tc>
       </w:tr>
       <w:tr>
+        <w:trPr>
+          <w:cantSplit w:val="true"/>
+        </w:trPr>
         <w:tc>
           <w:tcPr>
             <w:tcW w:type="dxa" w:w="3235"/>
@@ -12715,6 +12913,9 @@
         </w:tc>
       </w:tr>
       <w:tr>
+        <w:trPr>
+          <w:cantSplit w:val="true"/>
+        </w:trPr>
         <w:tc>
           <w:tcPr>
             <w:tcW w:type="dxa" w:w="3235"/>
@@ -12795,6 +12996,9 @@
         </w:tc>
       </w:tr>
       <w:tr>
+        <w:trPr>
+          <w:cantSplit w:val="true"/>
+        </w:trPr>
         <w:tc>
           <w:tcPr>
             <w:tcW w:type="dxa" w:w="3235"/>
@@ -12875,6 +13079,9 @@
         </w:tc>
       </w:tr>
       <w:tr>
+        <w:trPr>
+          <w:cantSplit w:val="true"/>
+        </w:trPr>
         <w:tc>
           <w:tcPr>
             <w:tcW w:type="dxa" w:w="3235"/>
@@ -12955,6 +13162,9 @@
         </w:tc>
       </w:tr>
       <w:tr>
+        <w:trPr>
+          <w:cantSplit w:val="true"/>
+        </w:trPr>
         <w:tc>
           <w:tcPr>
             <w:tcW w:type="dxa" w:w="3235"/>
@@ -13035,6 +13245,9 @@
         </w:tc>
       </w:tr>
       <w:tr>
+        <w:trPr>
+          <w:cantSplit w:val="true"/>
+        </w:trPr>
         <w:tc>
           <w:tcPr>
             <w:tcW w:type="dxa" w:w="3235"/>
@@ -13115,6 +13328,9 @@
         </w:tc>
       </w:tr>
       <w:tr>
+        <w:trPr>
+          <w:cantSplit w:val="true"/>
+        </w:trPr>
         <w:tc>
           <w:tcPr>
             <w:tcW w:type="dxa" w:w="3235"/>
@@ -13195,6 +13411,9 @@
         </w:tc>
       </w:tr>
       <w:tr>
+        <w:trPr>
+          <w:cantSplit w:val="true"/>
+        </w:trPr>
         <w:tc>
           <w:tcPr>
             <w:tcW w:type="dxa" w:w="3235"/>
@@ -14126,6 +14345,7 @@
       <w:tr>
         <w:trPr>
           <w:tblHeader w:val="true"/>
+          <w:cantSplit w:val="true"/>
         </w:trPr>
         <w:tc>
           <w:tcPr>
@@ -14185,6 +14405,9 @@
         </w:tc>
       </w:tr>
       <w:tr>
+        <w:trPr>
+          <w:cantSplit w:val="true"/>
+        </w:trPr>
         <w:tc>
           <w:tcPr>
             <w:tcW w:type="dxa" w:w="4853"/>
@@ -14239,6 +14462,9 @@
         </w:tc>
       </w:tr>
       <w:tr>
+        <w:trPr>
+          <w:cantSplit w:val="true"/>
+        </w:trPr>
         <w:tc>
           <w:tcPr>
             <w:tcW w:type="dxa" w:w="4853"/>
@@ -14293,6 +14519,9 @@
         </w:tc>
       </w:tr>
       <w:tr>
+        <w:trPr>
+          <w:cantSplit w:val="true"/>
+        </w:trPr>
         <w:tc>
           <w:tcPr>
             <w:tcW w:type="dxa" w:w="4853"/>
@@ -14347,6 +14576,9 @@
         </w:tc>
       </w:tr>
       <w:tr>
+        <w:trPr>
+          <w:cantSplit w:val="true"/>
+        </w:trPr>
         <w:tc>
           <w:tcPr>
             <w:tcW w:type="dxa" w:w="4853"/>
@@ -14401,6 +14633,9 @@
         </w:tc>
       </w:tr>
       <w:tr>
+        <w:trPr>
+          <w:cantSplit w:val="true"/>
+        </w:trPr>
         <w:tc>
           <w:tcPr>
             <w:tcW w:type="dxa" w:w="4853"/>
@@ -14455,6 +14690,9 @@
         </w:tc>
       </w:tr>
       <w:tr>
+        <w:trPr>
+          <w:cantSplit w:val="true"/>
+        </w:trPr>
         <w:tc>
           <w:tcPr>
             <w:tcW w:type="dxa" w:w="4853"/>
@@ -14509,6 +14747,9 @@
         </w:tc>
       </w:tr>
       <w:tr>
+        <w:trPr>
+          <w:cantSplit w:val="true"/>
+        </w:trPr>
         <w:tc>
           <w:tcPr>
             <w:tcW w:type="dxa" w:w="4853"/>
@@ -15617,7 +15858,7 @@
           <w:i w:val="0"/>
           <w:sz w:val="21"/>
         </w:rPr>
-        <w:t>The repository was inspected and exercised locally without asserting production deployment or partner-lender use.</w:t>
+        <w:t>The review covered the checked-out repository, its automated tests, one reproducible training run, the frontend build, and a local mock-mode walkthrough. No production deployment or partner-lender use was observed.</w:t>
       </w:r>
     </w:p>
     <w:p>
@@ -15770,7 +16011,7 @@
           <w:i w:val="0"/>
           <w:sz w:val="21"/>
         </w:rPr>
-        <w:t xml:space="preserve">. The service instead returns </w:t>
+        <w:t xml:space="preserve">. The service returns </w:t>
       </w:r>
       <w:r>
         <w:rPr>
@@ -15789,7 +16030,7 @@
           <w:i w:val="0"/>
           <w:sz w:val="21"/>
         </w:rPr>
-        <w:t xml:space="preserve"> because the supplied demonstration fairness report breaches the implemented disparity thresholds. The implementation is operating conservatively; the test oracle and approved policy expectation remain unresolved. The end-to-end logistic-regression training also reached the configured 200-iteration maximum, which is tracked as a model-development finding.</w:t>
+        <w:t xml:space="preserve"> because the supplied fairness rows exceed the implemented 0.10 disparity thresholds. The code and the test expectation remain inconsistent. The end-to-end logistic-regression training also reached the configured 200-iteration maximum, which is tracked as a separate model-development finding.</w:t>
       </w:r>
     </w:p>
     <w:p>
@@ -15822,6 +16063,7 @@
       <w:tr>
         <w:trPr>
           <w:tblHeader w:val="true"/>
+          <w:cantSplit w:val="true"/>
         </w:trPr>
         <w:tc>
           <w:tcPr>
@@ -15881,6 +16123,9 @@
         </w:tc>
       </w:tr>
       <w:tr>
+        <w:trPr>
+          <w:cantSplit w:val="true"/>
+        </w:trPr>
         <w:tc>
           <w:tcPr>
             <w:tcW w:type="dxa" w:w="4853"/>
@@ -15955,6 +16200,9 @@
         </w:tc>
       </w:tr>
       <w:tr>
+        <w:trPr>
+          <w:cantSplit w:val="true"/>
+        </w:trPr>
         <w:tc>
           <w:tcPr>
             <w:tcW w:type="dxa" w:w="4853"/>
@@ -16010,6 +16258,9 @@
         </w:tc>
       </w:tr>
       <w:tr>
+        <w:trPr>
+          <w:cantSplit w:val="true"/>
+        </w:trPr>
         <w:tc>
           <w:tcPr>
             <w:tcW w:type="dxa" w:w="4853"/>
@@ -16065,6 +16316,9 @@
         </w:tc>
       </w:tr>
       <w:tr>
+        <w:trPr>
+          <w:cantSplit w:val="true"/>
+        </w:trPr>
         <w:tc>
           <w:tcPr>
             <w:tcW w:type="dxa" w:w="4853"/>
@@ -16120,6 +16374,9 @@
         </w:tc>
       </w:tr>
       <w:tr>
+        <w:trPr>
+          <w:cantSplit w:val="true"/>
+        </w:trPr>
         <w:tc>
           <w:tcPr>
             <w:tcW w:type="dxa" w:w="4853"/>
@@ -16494,6 +16751,7 @@
       <w:tr>
         <w:trPr>
           <w:tblHeader w:val="true"/>
+          <w:cantSplit w:val="true"/>
         </w:trPr>
         <w:tc>
           <w:tcPr>
@@ -16581,6 +16839,9 @@
         </w:tc>
       </w:tr>
       <w:tr>
+        <w:trPr>
+          <w:cantSplit w:val="true"/>
+        </w:trPr>
         <w:tc>
           <w:tcPr>
             <w:tcW w:type="dxa" w:w="3235"/>
@@ -16681,6 +16942,9 @@
         </w:tc>
       </w:tr>
       <w:tr>
+        <w:trPr>
+          <w:cantSplit w:val="true"/>
+        </w:trPr>
         <w:tc>
           <w:tcPr>
             <w:tcW w:type="dxa" w:w="3235"/>
@@ -16781,6 +17045,9 @@
         </w:tc>
       </w:tr>
       <w:tr>
+        <w:trPr>
+          <w:cantSplit w:val="true"/>
+        </w:trPr>
         <w:tc>
           <w:tcPr>
             <w:tcW w:type="dxa" w:w="3235"/>
@@ -16881,6 +17148,9 @@
         </w:tc>
       </w:tr>
       <w:tr>
+        <w:trPr>
+          <w:cantSplit w:val="true"/>
+        </w:trPr>
         <w:tc>
           <w:tcPr>
             <w:tcW w:type="dxa" w:w="3235"/>
@@ -16962,6 +17232,9 @@
         </w:tc>
       </w:tr>
       <w:tr>
+        <w:trPr>
+          <w:cantSplit w:val="true"/>
+        </w:trPr>
         <w:tc>
           <w:tcPr>
             <w:tcW w:type="dxa" w:w="3235"/>
@@ -17081,6 +17354,9 @@
         </w:tc>
       </w:tr>
       <w:tr>
+        <w:trPr>
+          <w:cantSplit w:val="true"/>
+        </w:trPr>
         <w:tc>
           <w:tcPr>
             <w:tcW w:type="dxa" w:w="3235"/>
@@ -17162,6 +17438,9 @@
         </w:tc>
       </w:tr>
       <w:tr>
+        <w:trPr>
+          <w:cantSplit w:val="true"/>
+        </w:trPr>
         <w:tc>
           <w:tcPr>
             <w:tcW w:type="dxa" w:w="3235"/>
@@ -17243,6 +17522,9 @@
         </w:tc>
       </w:tr>
       <w:tr>
+        <w:trPr>
+          <w:cantSplit w:val="true"/>
+        </w:trPr>
         <w:tc>
           <w:tcPr>
             <w:tcW w:type="dxa" w:w="3235"/>
@@ -17343,6 +17625,9 @@
         </w:tc>
       </w:tr>
       <w:tr>
+        <w:trPr>
+          <w:cantSplit w:val="true"/>
+        </w:trPr>
         <w:tc>
           <w:tcPr>
             <w:tcW w:type="dxa" w:w="3235"/>
@@ -17433,6 +17718,9 @@
         </w:tc>
       </w:tr>
       <w:tr>
+        <w:trPr>
+          <w:cantSplit w:val="true"/>
+        </w:trPr>
         <w:tc>
           <w:tcPr>
             <w:tcW w:type="dxa" w:w="3235"/>
@@ -17523,6 +17811,9 @@
         </w:tc>
       </w:tr>
       <w:tr>
+        <w:trPr>
+          <w:cantSplit w:val="true"/>
+        </w:trPr>
         <w:tc>
           <w:tcPr>
             <w:tcW w:type="dxa" w:w="3235"/>
@@ -17642,6 +17933,9 @@
         </w:tc>
       </w:tr>
       <w:tr>
+        <w:trPr>
+          <w:cantSplit w:val="true"/>
+        </w:trPr>
         <w:tc>
           <w:tcPr>
             <w:tcW w:type="dxa" w:w="3235"/>
@@ -17723,6 +18017,9 @@
         </w:tc>
       </w:tr>
       <w:tr>
+        <w:trPr>
+          <w:cantSplit w:val="true"/>
+        </w:trPr>
         <w:tc>
           <w:tcPr>
             <w:tcW w:type="dxa" w:w="3235"/>
@@ -17861,7 +18158,26 @@
           <w:i w:val="0"/>
           <w:sz w:val="21"/>
         </w:rPr>
-        <w:t xml:space="preserve"> in mock mode. Twelve live interface captures were recorded after exercising scoring, explanation, fairness, portfolio analysis, borrower rights, outcome feedback, and governance interactions. The images are stored under </w:t>
+        <w:t xml:space="preserve"> in mock mode. Twelve local interface captures were recorded while walking through scoring, explanation, fairness, portfolio analysis, borrower rights, outcome feedback, and governance views. The mock adapter is fixture-backed, but its score function also generates a score, decision, request ID, and </w:t>
+      </w:r>
+      <w:r>
+        <w:rPr>
+          <w:rFonts w:ascii="Courier New" w:hAnsi="Courier New"/>
+          <w:b w:val="0"/>
+          <w:i w:val="0"/>
+          <w:color w:val="1B365D"/>
+          <w:sz w:val="18"/>
+        </w:rPr>
+        <w:t>created_at</w:t>
+      </w:r>
+      <w:r>
+        <w:rPr>
+          <w:rFonts w:ascii="Calibri" w:hAnsi="Calibri"/>
+          <w:b w:val="0"/>
+          <w:i w:val="0"/>
+          <w:sz w:val="21"/>
+        </w:rPr>
+        <w:t xml:space="preserve"> value at runtime; the screenshots therefore record one exercised session, not a bit-for-bit deterministic replay. The images are stored under </w:t>
       </w:r>
       <w:r>
         <w:rPr>
@@ -18337,20 +18653,6 @@
           <w:sz w:val="21"/>
         </w:rPr>
         <w:t>The screenshot evidence is mock-mode UI evidence; it does not demonstrate a production API, real applicant data, or lender deployment.</w:t>
-      </w:r>
-    </w:p>
-    <w:p>
-      <w:pPr>
-        <w:pStyle w:val="ListBullet"/>
-      </w:pPr>
-      <w:r>
-        <w:rPr>
-          <w:rFonts w:ascii="Calibri" w:hAnsi="Calibri"/>
-          <w:b w:val="0"/>
-          <w:i w:val="0"/>
-          <w:sz w:val="21"/>
-        </w:rPr>
-        <w:t>Pre-existing uncommitted frontend changes were not modified by this documentation work.</w:t>
       </w:r>
     </w:p>
     <w:p>
@@ -18561,7 +18863,7 @@
           <w:i w:val="0"/>
           <w:sz w:val="21"/>
         </w:rPr>
-        <w:t>, saving timestamped request/response transcripts with secrets and identifiers removed.</w:t>
+        <w:t>, saving sanitized request/response transcripts with secrets and direct identifiers removed.</w:t>
       </w:r>
     </w:p>
     <w:p>
@@ -18617,6 +18919,7 @@
       <w:tr>
         <w:trPr>
           <w:tblHeader w:val="true"/>
+          <w:cantSplit w:val="true"/>
         </w:trPr>
         <w:tc>
           <w:tcPr>
@@ -18732,6 +19035,9 @@
         </w:tc>
       </w:tr>
       <w:tr>
+        <w:trPr>
+          <w:cantSplit w:val="true"/>
+        </w:trPr>
         <w:tc>
           <w:tcPr>
             <w:tcW w:type="dxa" w:w="2426"/>
@@ -18838,6 +19144,9 @@
         </w:tc>
       </w:tr>
       <w:tr>
+        <w:trPr>
+          <w:cantSplit w:val="true"/>
+        </w:trPr>
         <w:tc>
           <w:tcPr>
             <w:tcW w:type="dxa" w:w="2426"/>
@@ -18944,6 +19253,9 @@
         </w:tc>
       </w:tr>
       <w:tr>
+        <w:trPr>
+          <w:cantSplit w:val="true"/>
+        </w:trPr>
         <w:tc>
           <w:tcPr>
             <w:tcW w:type="dxa" w:w="2426"/>
@@ -19050,6 +19362,9 @@
         </w:tc>
       </w:tr>
       <w:tr>
+        <w:trPr>
+          <w:cantSplit w:val="true"/>
+        </w:trPr>
         <w:tc>
           <w:tcPr>
             <w:tcW w:type="dxa" w:w="2426"/>
@@ -19156,6 +19471,9 @@
         </w:tc>
       </w:tr>
       <w:tr>
+        <w:trPr>
+          <w:cantSplit w:val="true"/>
+        </w:trPr>
         <w:tc>
           <w:tcPr>
             <w:tcW w:type="dxa" w:w="2426"/>
@@ -19262,6 +19580,9 @@
         </w:tc>
       </w:tr>
       <w:tr>
+        <w:trPr>
+          <w:cantSplit w:val="true"/>
+        </w:trPr>
         <w:tc>
           <w:tcPr>
             <w:tcW w:type="dxa" w:w="2426"/>
@@ -19368,6 +19689,9 @@
         </w:tc>
       </w:tr>
       <w:tr>
+        <w:trPr>
+          <w:cantSplit w:val="true"/>
+        </w:trPr>
         <w:tc>
           <w:tcPr>
             <w:tcW w:type="dxa" w:w="2426"/>
@@ -19474,6 +19798,9 @@
         </w:tc>
       </w:tr>
       <w:tr>
+        <w:trPr>
+          <w:cantSplit w:val="true"/>
+        </w:trPr>
         <w:tc>
           <w:tcPr>
             <w:tcW w:type="dxa" w:w="2426"/>
@@ -19580,6 +19907,9 @@
         </w:tc>
       </w:tr>
       <w:tr>
+        <w:trPr>
+          <w:cantSplit w:val="true"/>
+        </w:trPr>
         <w:tc>
           <w:tcPr>
             <w:tcW w:type="dxa" w:w="2426"/>
@@ -19686,6 +20016,9 @@
         </w:tc>
       </w:tr>
       <w:tr>
+        <w:trPr>
+          <w:cantSplit w:val="true"/>
+        </w:trPr>
         <w:tc>
           <w:tcPr>
             <w:tcW w:type="dxa" w:w="2426"/>
@@ -19792,6 +20125,9 @@
         </w:tc>
       </w:tr>
       <w:tr>
+        <w:trPr>
+          <w:cantSplit w:val="true"/>
+        </w:trPr>
         <w:tc>
           <w:tcPr>
             <w:tcW w:type="dxa" w:w="2426"/>
@@ -19898,6 +20234,9 @@
         </w:tc>
       </w:tr>
       <w:tr>
+        <w:trPr>
+          <w:cantSplit w:val="true"/>
+        </w:trPr>
         <w:tc>
           <w:tcPr>
             <w:tcW w:type="dxa" w:w="2426"/>
@@ -20004,6 +20343,9 @@
         </w:tc>
       </w:tr>
       <w:tr>
+        <w:trPr>
+          <w:cantSplit w:val="true"/>
+        </w:trPr>
         <w:tc>
           <w:tcPr>
             <w:tcW w:type="dxa" w:w="2426"/>
@@ -20110,6 +20452,9 @@
         </w:tc>
       </w:tr>
       <w:tr>
+        <w:trPr>
+          <w:cantSplit w:val="true"/>
+        </w:trPr>
         <w:tc>
           <w:tcPr>
             <w:tcW w:type="dxa" w:w="2426"/>
@@ -20884,6 +21229,7 @@
       <w:tr>
         <w:trPr>
           <w:tblHeader w:val="true"/>
+          <w:cantSplit w:val="true"/>
         </w:trPr>
         <w:tc>
           <w:tcPr>
@@ -20971,6 +21317,9 @@
         </w:tc>
       </w:tr>
       <w:tr>
+        <w:trPr>
+          <w:cantSplit w:val="true"/>
+        </w:trPr>
         <w:tc>
           <w:tcPr>
             <w:tcW w:type="dxa" w:w="3235"/>
@@ -21051,6 +21400,9 @@
         </w:tc>
       </w:tr>
       <w:tr>
+        <w:trPr>
+          <w:cantSplit w:val="true"/>
+        </w:trPr>
         <w:tc>
           <w:tcPr>
             <w:tcW w:type="dxa" w:w="3235"/>
@@ -21131,6 +21483,9 @@
         </w:tc>
       </w:tr>
       <w:tr>
+        <w:trPr>
+          <w:cantSplit w:val="true"/>
+        </w:trPr>
         <w:tc>
           <w:tcPr>
             <w:tcW w:type="dxa" w:w="3235"/>
@@ -21211,6 +21566,9 @@
         </w:tc>
       </w:tr>
       <w:tr>
+        <w:trPr>
+          <w:cantSplit w:val="true"/>
+        </w:trPr>
         <w:tc>
           <w:tcPr>
             <w:tcW w:type="dxa" w:w="3235"/>
@@ -21291,6 +21649,9 @@
         </w:tc>
       </w:tr>
       <w:tr>
+        <w:trPr>
+          <w:cantSplit w:val="true"/>
+        </w:trPr>
         <w:tc>
           <w:tcPr>
             <w:tcW w:type="dxa" w:w="3235"/>
@@ -21371,6 +21732,9 @@
         </w:tc>
       </w:tr>
       <w:tr>
+        <w:trPr>
+          <w:cantSplit w:val="true"/>
+        </w:trPr>
         <w:tc>
           <w:tcPr>
             <w:tcW w:type="dxa" w:w="3235"/>
@@ -21451,6 +21815,9 @@
         </w:tc>
       </w:tr>
       <w:tr>
+        <w:trPr>
+          <w:cantSplit w:val="true"/>
+        </w:trPr>
         <w:tc>
           <w:tcPr>
             <w:tcW w:type="dxa" w:w="3235"/>
@@ -21531,6 +21898,9 @@
         </w:tc>
       </w:tr>
       <w:tr>
+        <w:trPr>
+          <w:cantSplit w:val="true"/>
+        </w:trPr>
         <w:tc>
           <w:tcPr>
             <w:tcW w:type="dxa" w:w="3235"/>
@@ -21671,7 +22041,7 @@
           <w:i w:val="0"/>
           <w:sz w:val="21"/>
         </w:rPr>
-        <w:t>The figures in this section are normative design views. They are not marketing illustrations. Each figure identifies a system boundary, a control hand-off, or an evidence relationship that must be implemented and tested. The SVG files are the editable masters; PNG copies are provided for Word, email, and review systems that do not render SVG reliably.</w:t>
+        <w:t>Each figure answers a specific engineering question: where the lender's responsibility ends, how one scoring transaction is reconstructed, where sensitive data is separated, how a model reaches production, and what happens after a fairness trigger. These are target-state design views, not proof that every control is already implemented. The SVG files are the editable masters; PNG copies are included for Word, email, and review systems that do not render SVG reliably.</w:t>
       </w:r>
     </w:p>
     <w:p>
@@ -23012,7 +23382,7 @@
           <w:i w:val="0"/>
           <w:sz w:val="21"/>
         </w:rPr>
-        <w:t xml:space="preserve">This section documents the working React demonstration console included in </w:t>
+        <w:t xml:space="preserve">The React console in </w:t>
       </w:r>
       <w:r>
         <w:rPr>
@@ -23031,7 +23401,7 @@
           <w:i w:val="0"/>
           <w:sz w:val="21"/>
         </w:rPr>
-        <w:t>. The screens below were captured from the repository's locally running application in mock mode. They show implemented interaction paths and presentation behavior; they do not represent a production lending deployment or the use of real applicant records.</w:t>
+        <w:t xml:space="preserve"> was run locally and reviewed screen by screen. The captures below show the implemented navigation, input, result, explanation, fairness, portfolio, borrower-rights, outcome, audit, and governance views. They are product evidence, but only for the local mock-mode interface; no real applicant record or production lending service was used.</w:t>
       </w:r>
     </w:p>
     <w:p>
@@ -23076,7 +23446,94 @@
           <w:i w:val="0"/>
           <w:sz w:val="21"/>
         </w:rPr>
-        <w:t xml:space="preserve"> is not configured, the client selects the repository's deterministic mock adapter. Mock mode exercises the same TypeScript request and response shapes used by the live FastAPI integration, which makes it suitable for interface review, workflow demonstrations, and document evidence without transmitting applicant information.</w:t>
+        <w:t xml:space="preserve"> is absent, empty, or set to </w:t>
+      </w:r>
+      <w:r>
+        <w:rPr>
+          <w:rFonts w:ascii="Courier New" w:hAnsi="Courier New"/>
+          <w:b w:val="0"/>
+          <w:i w:val="0"/>
+          <w:color w:val="1B365D"/>
+          <w:sz w:val="18"/>
+        </w:rPr>
+        <w:t>mock</w:t>
+      </w:r>
+      <w:r>
+        <w:rPr>
+          <w:rFonts w:ascii="Calibri" w:hAnsi="Calibri"/>
+          <w:b w:val="0"/>
+          <w:i w:val="0"/>
+          <w:sz w:val="21"/>
+        </w:rPr>
+        <w:t xml:space="preserve">, the client selects the local mock adapter. That adapter reuses the frontend's production request and response types, but it is not a full simulation of the FastAPI service. Model, contract, fairness, governance, portfolio, and audit panels are fixture-backed. The scoring function also generates the score, decision, request ID, and </w:t>
+      </w:r>
+      <w:r>
+        <w:rPr>
+          <w:rFonts w:ascii="Courier New" w:hAnsi="Courier New"/>
+          <w:b w:val="0"/>
+          <w:i w:val="0"/>
+          <w:color w:val="1B365D"/>
+          <w:sz w:val="18"/>
+        </w:rPr>
+        <w:t>created_at</w:t>
+      </w:r>
+      <w:r>
+        <w:rPr>
+          <w:rFonts w:ascii="Calibri" w:hAnsi="Calibri"/>
+          <w:b w:val="0"/>
+          <w:i w:val="0"/>
+          <w:sz w:val="21"/>
+        </w:rPr>
+        <w:t xml:space="preserve"> value at runtime. Mock mode is therefore useful for interface review, but not for reproducibility, model-fidelity, persistence, or audit claims.</w:t>
+      </w:r>
+    </w:p>
+    <w:p>
+      <w:r>
+        <w:rPr>
+          <w:rFonts w:ascii="Calibri" w:hAnsi="Calibri"/>
+          <w:b w:val="0"/>
+          <w:i w:val="0"/>
+          <w:sz w:val="21"/>
+        </w:rPr>
+        <w:t xml:space="preserve">One visible difference matters during review: the mock model card reports version </w:t>
+      </w:r>
+      <w:r>
+        <w:rPr>
+          <w:rFonts w:ascii="Courier New" w:hAnsi="Courier New"/>
+          <w:b w:val="0"/>
+          <w:i w:val="0"/>
+          <w:color w:val="1B365D"/>
+          <w:sz w:val="18"/>
+        </w:rPr>
+        <w:t>0.1.0</w:t>
+      </w:r>
+      <w:r>
+        <w:rPr>
+          <w:rFonts w:ascii="Calibri" w:hAnsi="Calibri"/>
+          <w:b w:val="0"/>
+          <w:i w:val="0"/>
+          <w:sz w:val="21"/>
+        </w:rPr>
+        <w:t xml:space="preserve">, while the reproducible training evidence in Appendices B and C reports version </w:t>
+      </w:r>
+      <w:r>
+        <w:rPr>
+          <w:rFonts w:ascii="Courier New" w:hAnsi="Courier New"/>
+          <w:b w:val="0"/>
+          <w:i w:val="0"/>
+          <w:color w:val="1B365D"/>
+          <w:sz w:val="18"/>
+        </w:rPr>
+        <w:t>0.0.1</w:t>
+      </w:r>
+      <w:r>
+        <w:rPr>
+          <w:rFonts w:ascii="Calibri" w:hAnsi="Calibri"/>
+          <w:b w:val="0"/>
+          <w:i w:val="0"/>
+          <w:sz w:val="21"/>
+        </w:rPr>
+        <w:t>. The former is a frontend fixture; the latter is the model produced by the documented training command.</w:t>
       </w:r>
     </w:p>
     <w:tbl>
@@ -23152,6 +23609,7 @@
       <w:tr>
         <w:trPr>
           <w:tblHeader w:val="true"/>
+          <w:cantSplit w:val="true"/>
         </w:trPr>
         <w:tc>
           <w:tcPr>
@@ -23239,6 +23697,9 @@
         </w:tc>
       </w:tr>
       <w:tr>
+        <w:trPr>
+          <w:cantSplit w:val="true"/>
+        </w:trPr>
         <w:tc>
           <w:tcPr>
             <w:tcW w:type="dxa" w:w="3235"/>
@@ -23377,6 +23838,9 @@
         </w:tc>
       </w:tr>
       <w:tr>
+        <w:trPr>
+          <w:cantSplit w:val="true"/>
+        </w:trPr>
         <w:tc>
           <w:tcPr>
             <w:tcW w:type="dxa" w:w="3235"/>
@@ -23457,6 +23921,9 @@
         </w:tc>
       </w:tr>
       <w:tr>
+        <w:trPr>
+          <w:cantSplit w:val="true"/>
+        </w:trPr>
         <w:tc>
           <w:tcPr>
             <w:tcW w:type="dxa" w:w="3235"/>
@@ -23537,6 +24004,9 @@
         </w:tc>
       </w:tr>
       <w:tr>
+        <w:trPr>
+          <w:cantSplit w:val="true"/>
+        </w:trPr>
         <w:tc>
           <w:tcPr>
             <w:tcW w:type="dxa" w:w="3235"/>
@@ -23617,6 +24087,9 @@
         </w:tc>
       </w:tr>
       <w:tr>
+        <w:trPr>
+          <w:cantSplit w:val="true"/>
+        </w:trPr>
         <w:tc>
           <w:tcPr>
             <w:tcW w:type="dxa" w:w="3235"/>
@@ -23782,7 +24255,7 @@
           <w:i w:val="0"/>
           <w:sz w:val="21"/>
         </w:rPr>
-        <w:t xml:space="preserve">The landing view gives the operator a fast integrity check before any scoring action. The four status cards are not decorative metrics: together they identify the service state, model artifact, input contract, and threshold that govern downstream decisions. The </w:t>
+        <w:t xml:space="preserve">The landing view gives the operator a quick orientation before any scoring action. In live mode, the four cards identify the service state, model artifact, input contract, and threshold used downstream. In the captured mock session, those values come from fixtures and should be read as layout and workflow evidence. The </w:t>
       </w:r>
       <w:r>
         <w:rPr>
@@ -24028,7 +24501,7 @@
           <w:i w:val="0"/>
           <w:sz w:val="21"/>
         </w:rPr>
-        <w:t>The decision workbench is generated from the active feature contract instead of a separately maintained list of form fields. Each definition supplies the field name, label, description, minimum, maximum, step size, default value, requirement flag, and directional interpretation. This prevents silent drift between the browser form and the scoring schema.</w:t>
+        <w:t>The decision workbench is generated from the feature-contract response instead of a separately maintained list of form fields. Each definition supplies the field name, label, description, minimum, maximum, step size, default value, requirement flag, and directional interpretation. This reduces the chance that the browser form drifts from the published schema. It does not by itself prove that the backend enforces every displayed bound; the current scoring path performs only limited range sanitization.</w:t>
       </w:r>
     </w:p>
     <w:p>
@@ -24063,7 +24536,7 @@
           <w:i w:val="0"/>
           <w:sz w:val="21"/>
         </w:rPr>
-        <w:t xml:space="preserve"> identifies the request in the user workflow; the audit layer stores a hashed representation rather than the direct identifier.</w:t>
+        <w:t xml:space="preserve"> identifies the request in the user workflow. In the FastAPI path, configured audit settings replace it with a pseudonymous reference before persistence. The mock adapter does not create a production audit record.</w:t>
       </w:r>
     </w:p>
     <w:p>
@@ -24375,7 +24848,7 @@
           <w:i w:val="0"/>
           <w:sz w:val="21"/>
         </w:rPr>
-        <w:t>The result panel keeps the numerical score, decision threshold, decision label, model version, and reason codes in one visual record. The adjoining borrower-transparency view translates stable reason codes into plain-language factors and suggested next steps. The interface also states that protected characteristics are not used to generate the score and exposes a human-review path.</w:t>
+        <w:t>The result panel places the numerical score, decision threshold, decision label, model version, and reason codes in one view. The adjoining borrower-transparency panel translates reason-code fixtures into plain-language factors and suggested next steps. The interface also states that protected characteristics are not used to generate the score and exposes a human-review path. In mock mode, the score and decision are generated at runtime while the reason codes come from a fixed fixture, so this screen does not establish explanation fidelity.</w:t>
       </w:r>
     </w:p>
     <w:p>
@@ -24414,7 +24887,7 @@
           <w:i w:val="0"/>
           <w:sz w:val="21"/>
         </w:rPr>
-        <w:t>Reason codes are derived from governed feature contributions and must remain stable across API, audit, and notice-generation layers.</w:t>
+        <w:t>In the FastAPI path, reason codes are generated from submitted feature values. Their fidelity and stability still need dedicated tests across API, audit, and notice-generation layers.</w:t>
       </w:r>
     </w:p>
     <w:p>
@@ -24530,18 +25003,18 @@
           <w:i w:val="0"/>
           <w:sz w:val="21"/>
         </w:rPr>
-        <w:t>The explanation panel ranks feature contributions by absolute magnitude. Positive bars increase the model output relative to the local baseline; negative bars reduce it. The panel binds the explanation request to the application reference and the latest score request so an auditor can reconcile the views.</w:t>
-      </w:r>
-    </w:p>
-    <w:p>
-      <w:r>
-        <w:rPr>
-          <w:rFonts w:ascii="Calibri" w:hAnsi="Calibri"/>
-          <w:b w:val="0"/>
-          <w:i w:val="0"/>
-          <w:sz w:val="21"/>
-        </w:rPr>
-        <w:t xml:space="preserve">The fairness monitor operates on a synthetic batch with protected-group labels, predicted outcomes, and observed labels. Selecting </w:t>
+        <w:t>The explanation panel ranks feature contributions by absolute magnitude. Positive bars increase the model output relative to the local baseline; negative bars reduce it. The panel displays the application reference and its own explanation request ID. A production audit design should also carry an explicit link to the scored decision being explained; the current response contract does not expose that parent request ID.</w:t>
+      </w:r>
+    </w:p>
+    <w:p>
+      <w:r>
+        <w:rPr>
+          <w:rFonts w:ascii="Calibri" w:hAnsi="Calibri"/>
+          <w:b w:val="0"/>
+          <w:i w:val="0"/>
+          <w:sz w:val="21"/>
+        </w:rPr>
+        <w:t xml:space="preserve">The fairness panel displays a synthetic batch with protected-group labels, predicted outcomes, and observed labels. In live mode, </w:t>
       </w:r>
       <w:r>
         <w:rPr>
@@ -24560,7 +25033,26 @@
           <w:i w:val="0"/>
           <w:sz w:val="21"/>
         </w:rPr>
-        <w:t xml:space="preserve"> calculates demographic-parity and equal-opportunity differences and returns group-level selection rates and counts. The batch generator is intentionally visible so reviewers do not mistake the demonstration values for deployment evidence.</w:t>
+        <w:t xml:space="preserve"> sends those rows to </w:t>
+      </w:r>
+      <w:r>
+        <w:rPr>
+          <w:rFonts w:ascii="Courier New" w:hAnsi="Courier New"/>
+          <w:b w:val="0"/>
+          <w:i w:val="0"/>
+          <w:color w:val="1B365D"/>
+          <w:sz w:val="18"/>
+        </w:rPr>
+        <w:t>/v1/audit/fairness</w:t>
+      </w:r>
+      <w:r>
+        <w:rPr>
+          <w:rFonts w:ascii="Calibri" w:hAnsi="Calibri"/>
+          <w:b w:val="0"/>
+          <w:i w:val="0"/>
+          <w:sz w:val="21"/>
+        </w:rPr>
+        <w:t>, where the service calculates demographic-parity and equal-opportunity differences, group counts, selection rates, and true-positive rates. In mock mode, the button returns a fixed fairness fixture. The batch controls remain visible so a reviewer can see the intended workflow without mistaking the fixture for deployment evidence.</w:t>
       </w:r>
     </w:p>
     <w:p>
@@ -24768,7 +25260,7 @@
           <w:i w:val="0"/>
           <w:sz w:val="21"/>
         </w:rPr>
-        <w:t>The portfolio workbench evaluates a cohort against one model contract and one threshold. The operator can choose the demonstration cohort size and the protected attribute used only for aggregated monitoring. Results combine decision statistics, reason-code frequency, score-band distribution, and a small row-level preview.</w:t>
+        <w:t>The portfolio workbench is designed to evaluate a cohort against one model contract and threshold. The operator can choose the demonstration cohort size and the protected attribute used only for aggregated monitoring. In live mode, the API scores the submitted applications; in mock mode, the panel slices a prepared portfolio fixture to the requested size. Results combine decision statistics, reason-code frequency, score-band distribution, and a small row-level preview.</w:t>
       </w:r>
     </w:p>
     <w:p>
@@ -24867,7 +25359,7 @@
           <w:i w:val="0"/>
           <w:sz w:val="21"/>
         </w:rPr>
-        <w:t>The governance center exposes the evidence chain used to reproduce a decision: permission, source connection, validation, versioned features, and the final scored decision. Adjacent controls connect the decision to observed repayment outcomes and governed model updates. The audit explorer filters append-only events by type and application reference without requiring direct personal identifiers in the display.</w:t>
+        <w:t>The governance center presents the evidence chain a production system would use to reproduce a decision: permission, source connection, validation, versioned features, and the final scored decision. Adjacent controls show how repayment outcomes and governed model updates would be connected. In the captured session, the lineage, control coverage, and audit rows are fixtures. The audit explorer can filter those fixture rows by type and application reference; the live API path queries the append-style JSONL store.</w:t>
       </w:r>
     </w:p>
     <w:p>
@@ -25424,7 +25916,26 @@
           <w:i w:val="0"/>
           <w:sz w:val="21"/>
         </w:rPr>
-        <w:t>The outcome workflow connects a prior decision to later verified performance. The operator selects a governed observation window and records a binary result. The mock adapter returns confirmation that the outcome event was recorded and governance metrics were refreshed. In production, the same action requires source provenance, correction handling, late-arriving-event policy, access controls, retention rules, and an immutable link to the original decision event.</w:t>
+        <w:t xml:space="preserve">The outcome workflow shows how a prior decision can be linked to later verified performance. The operator selects an observation window and records a binary result. The mock adapter returns </w:t>
+      </w:r>
+      <w:r>
+        <w:rPr>
+          <w:rFonts w:ascii="Courier New" w:hAnsi="Courier New"/>
+          <w:b w:val="0"/>
+          <w:i w:val="0"/>
+          <w:color w:val="1B365D"/>
+          <w:sz w:val="18"/>
+        </w:rPr>
+        <w:t>status: ok</w:t>
+      </w:r>
+      <w:r>
+        <w:rPr>
+          <w:rFonts w:ascii="Calibri" w:hAnsi="Calibri"/>
+          <w:b w:val="0"/>
+          <w:i w:val="0"/>
+          <w:sz w:val="21"/>
+        </w:rPr>
+        <w:t>, after which the UI refetches its governance query; it does not persist an outcome or recalculate governance metrics. The live FastAPI path appends an outcome event. A production implementation would also need source provenance, correction handling, late-arriving-event policy, access controls, retention rules, and an immutable link to the original decision event.</w:t>
       </w:r>
     </w:p>
     <w:p>
@@ -25512,7 +26023,7 @@
           <w:i w:val="0"/>
           <w:sz w:val="21"/>
         </w:rPr>
-        <w:t>The monitoring tab presents four different control families rather than collapsing them into a single health score. Feature drift tests input-distribution change, calibration gap tests the relationship between predicted and observed outcomes, parity difference tests subgroup selection behavior, and explanation stability tests whether contribution patterns change unexpectedly. Each signal needs its own population window, baseline, threshold, severity, owner, and escalation runbook.</w:t>
+        <w:t>The monitoring tab presents four control families instead of collapsing them into one health score. In the current frontend, the displayed values are fixtures. The intended interpretation is still useful: feature drift concerns input-distribution change, calibration gap compares predictions with observed outcomes, parity difference tracks subgroup selection behavior, and explanation stability tracks unexpected changes in contribution patterns. A connected implementation needs a population window, baseline, threshold, severity, owner, and escalation runbook for each signal.</w:t>
       </w:r>
     </w:p>
     <w:p>
@@ -25544,7 +26055,7 @@
         <w:drawing>
           <wp:inline xmlns:a="http://schemas.openxmlformats.org/drawingml/2006/main" xmlns:pic="http://schemas.openxmlformats.org/drawingml/2006/picture">
             <wp:extent cx="6080760" cy="3800475"/>
-            <wp:docPr id="18" name="Picture 18" descr="Governance control register showing live evidence coverage and control rows for data rights, lineage, subgroup evaluation, explanation review, and audit capture." title="Governance control register showing live evidence coverage and control rows for data rights, lineage, subgroup evaluation, explanation review, and audit capture."/>
+            <wp:docPr id="18" name="Picture 18" descr="Governance control register showing displayed evidence coverage and control rows for data rights, lineage, subgroup evaluation, explanation review, and audit capture." title="Governance control register showing displayed evidence coverage and control rows for data rights, lineage, subgroup evaluation, explanation review, and audit capture."/>
             <wp:cNvGraphicFramePr>
               <a:graphicFrameLocks noChangeAspect="1"/>
             </wp:cNvGraphicFramePr>
@@ -25589,18 +26100,18 @@
           <w:color w:val="505A69"/>
           <w:sz w:val="18"/>
         </w:rPr>
-        <w:t>Governance control register showing live evidence coverage and control rows for data rights, lineage, subgroup evaluation, explanation review, and audit capture.</w:t>
-      </w:r>
-    </w:p>
-    <w:p>
-      <w:r>
-        <w:rPr>
-          <w:rFonts w:ascii="Calibri" w:hAnsi="Calibri"/>
-          <w:b w:val="0"/>
-          <w:i w:val="0"/>
-          <w:sz w:val="21"/>
-        </w:rPr>
-        <w:t>The control register binds operating evidence to named governance controls. The header strip summarizes explanation coverage, observed-outcome coverage, fairness review, and audit capture. Control rows identify the domain, accountable function, required evidence, and current readiness state. A production register should replace fixture values with queryable evidence identifiers and should require recorded approval before a control can change from review or planned to ready.</w:t>
+        <w:t>Governance control register showing displayed evidence coverage and control rows for data rights, lineage, subgroup evaluation, explanation review, and audit capture.</w:t>
+      </w:r>
+    </w:p>
+    <w:p>
+      <w:r>
+        <w:rPr>
+          <w:rFonts w:ascii="Calibri" w:hAnsi="Calibri"/>
+          <w:b w:val="0"/>
+          <w:i w:val="0"/>
+          <w:sz w:val="21"/>
+        </w:rPr>
+        <w:t>The control register shows the intended link between operating evidence and named governance controls. The header strip summarizes explanation coverage, observed-outcome coverage, fairness review, and audit capture. Control rows identify the domain, accountable function, required evidence, and readiness state. The captured values are fixtures. A production register must replace them with queryable evidence identifiers and require recorded approval before a control can move from review or planned to ready.</w:t>
       </w:r>
     </w:p>
     <w:p>
@@ -25890,7 +26401,7 @@
           <w:i w:val="0"/>
           <w:sz w:val="21"/>
         </w:rPr>
-        <w:t>Use the audit explorer to confirm that the decision, explanation, fairness, and portfolio events are indexed.</w:t>
+        <w:t>Use the audit explorer to confirm that the expected fixture event categories are visible. Repeat the workflow in live mode when validating newly persisted events.</w:t>
       </w:r>
     </w:p>
     <w:p>
@@ -25919,7 +26430,35 @@
           <w:i w:val="0"/>
           <w:sz w:val="21"/>
         </w:rPr>
-        <w:t>The screenshots use deterministic mock responses and synthetic applicant features.</w:t>
+        <w:t>The screenshots use synthetic features and fixture-backed mock views. Some scoring fields are generated at runtime, so separate mock runs are not bit-for-bit identical.</w:t>
+      </w:r>
+    </w:p>
+    <w:p>
+      <w:pPr>
+        <w:pStyle w:val="ListBullet"/>
+      </w:pPr>
+      <w:r>
+        <w:rPr>
+          <w:rFonts w:ascii="Calibri" w:hAnsi="Calibri"/>
+          <w:b w:val="0"/>
+          <w:i w:val="0"/>
+          <w:sz w:val="21"/>
+        </w:rPr>
+        <w:t>Mock scoring does not prove that the displayed reason codes explain the generated score or decision.</w:t>
+      </w:r>
+    </w:p>
+    <w:p>
+      <w:pPr>
+        <w:pStyle w:val="ListBullet"/>
+      </w:pPr>
+      <w:r>
+        <w:rPr>
+          <w:rFonts w:ascii="Calibri" w:hAnsi="Calibri"/>
+          <w:b w:val="0"/>
+          <w:i w:val="0"/>
+          <w:sz w:val="21"/>
+        </w:rPr>
+        <w:t>Mock fairness, governance, monitoring, portfolio, and audit values are presentation fixtures unless a section explicitly cites the live API evidence run.</w:t>
       </w:r>
     </w:p>
     <w:p>
@@ -26007,7 +26546,7 @@
           <w:i w:val="0"/>
           <w:sz w:val="21"/>
         </w:rPr>
-        <w:t>This consolidated dossier is structured as a submission-ready technical evidence package for architecture, engineering, model-risk, responsible-AI, compliance, grant, or immigration review. It records what is implemented, what was exercised, what is shown in the product demonstration, and what remains incomplete. Submission readiness in this section means that the evidence is organized, traceable, printable, and reviewable. It does not mean the platform is authorized for production lending.</w:t>
+        <w:t>This section is the reviewer handoff. It maps each requested evidence category to source code, tests, machine-readable artifacts, diagrams, or product captures and states where the evidence stops. The dossier is ready to print and review; the software is not authorized for production lending.</w:t>
       </w:r>
     </w:p>
     <w:p>
@@ -26040,6 +26579,7 @@
       <w:tr>
         <w:trPr>
           <w:tblHeader w:val="true"/>
+          <w:cantSplit w:val="true"/>
         </w:trPr>
         <w:tc>
           <w:tcPr>
@@ -26099,6 +26639,9 @@
         </w:tc>
       </w:tr>
       <w:tr>
+        <w:trPr>
+          <w:cantSplit w:val="true"/>
+        </w:trPr>
         <w:tc>
           <w:tcPr>
             <w:tcW w:type="dxa" w:w="4853"/>
@@ -26153,6 +26696,9 @@
         </w:tc>
       </w:tr>
       <w:tr>
+        <w:trPr>
+          <w:cantSplit w:val="true"/>
+        </w:trPr>
         <w:tc>
           <w:tcPr>
             <w:tcW w:type="dxa" w:w="4853"/>
@@ -26208,6 +26754,9 @@
         </w:tc>
       </w:tr>
       <w:tr>
+        <w:trPr>
+          <w:cantSplit w:val="true"/>
+        </w:trPr>
         <w:tc>
           <w:tcPr>
             <w:tcW w:type="dxa" w:w="4853"/>
@@ -26262,6 +26811,9 @@
         </w:tc>
       </w:tr>
       <w:tr>
+        <w:trPr>
+          <w:cantSplit w:val="true"/>
+        </w:trPr>
         <w:tc>
           <w:tcPr>
             <w:tcW w:type="dxa" w:w="4853"/>
@@ -26310,12 +26862,15 @@
                 <w:i w:val="0"/>
                 <w:sz w:val="17"/>
               </w:rPr>
-              <w:t>Local deterministic mock mode using synthetic applicant and outcome data</w:t>
+              <w:t>Local mock mode using synthetic inputs, typed fixtures, and runtime-generated mock fields</w:t>
             </w:r>
           </w:p>
         </w:tc>
       </w:tr>
       <w:tr>
+        <w:trPr>
+          <w:cantSplit w:val="true"/>
+        </w:trPr>
         <w:tc>
           <w:tcPr>
             <w:tcW w:type="dxa" w:w="4853"/>
@@ -26370,6 +26925,9 @@
         </w:tc>
       </w:tr>
       <w:tr>
+        <w:trPr>
+          <w:cantSplit w:val="true"/>
+        </w:trPr>
         <w:tc>
           <w:tcPr>
             <w:tcW w:type="dxa" w:w="4853"/>
@@ -26424,6 +26982,9 @@
         </w:tc>
       </w:tr>
       <w:tr>
+        <w:trPr>
+          <w:cantSplit w:val="true"/>
+        </w:trPr>
         <w:tc>
           <w:tcPr>
             <w:tcW w:type="dxa" w:w="4853"/>
@@ -26478,6 +27039,9 @@
         </w:tc>
       </w:tr>
       <w:tr>
+        <w:trPr>
+          <w:cantSplit w:val="true"/>
+        </w:trPr>
         <w:tc>
           <w:tcPr>
             <w:tcW w:type="dxa" w:w="4853"/>
@@ -26545,7 +27109,7 @@
           <w:i w:val="0"/>
           <w:sz w:val="21"/>
         </w:rPr>
-        <w:t>The package can be submitted as evidence that a coherent technical system has been designed and partially implemented. It should not be described as evidence of real-world model efficacy, favorable impact, legal compliance, production security, or a completed lender deployment.</w:t>
+        <w:t>The evidence supports a narrow, defensible statement: the repository contains a connected reference implementation, and the main development and interface paths have been exercised. It does not establish real-world model efficacy, favorable impact, legal compliance, production security, or a completed lender deployment.</w:t>
       </w:r>
     </w:p>
     <w:p>
@@ -26581,6 +27145,7 @@
       <w:tr>
         <w:trPr>
           <w:tblHeader w:val="true"/>
+          <w:cantSplit w:val="true"/>
         </w:trPr>
         <w:tc>
           <w:tcPr>
@@ -26724,6 +27289,9 @@
         </w:tc>
       </w:tr>
       <w:tr>
+        <w:trPr>
+          <w:cantSplit w:val="true"/>
+        </w:trPr>
         <w:tc>
           <w:tcPr>
             <w:tcW w:type="dxa" w:w="1941"/>
@@ -26866,6 +27434,9 @@
         </w:tc>
       </w:tr>
       <w:tr>
+        <w:trPr>
+          <w:cantSplit w:val="true"/>
+        </w:trPr>
         <w:tc>
           <w:tcPr>
             <w:tcW w:type="dxa" w:w="1941"/>
@@ -26998,6 +27569,9 @@
         </w:tc>
       </w:tr>
       <w:tr>
+        <w:trPr>
+          <w:cantSplit w:val="true"/>
+        </w:trPr>
         <w:tc>
           <w:tcPr>
             <w:tcW w:type="dxa" w:w="1941"/>
@@ -27207,6 +27781,9 @@
         </w:tc>
       </w:tr>
       <w:tr>
+        <w:trPr>
+          <w:cantSplit w:val="true"/>
+        </w:trPr>
         <w:tc>
           <w:tcPr>
             <w:tcW w:type="dxa" w:w="1941"/>
@@ -27339,6 +27916,9 @@
         </w:tc>
       </w:tr>
       <w:tr>
+        <w:trPr>
+          <w:cantSplit w:val="true"/>
+        </w:trPr>
         <w:tc>
           <w:tcPr>
             <w:tcW w:type="dxa" w:w="1941"/>
@@ -27471,6 +28051,9 @@
         </w:tc>
       </w:tr>
       <w:tr>
+        <w:trPr>
+          <w:cantSplit w:val="true"/>
+        </w:trPr>
         <w:tc>
           <w:tcPr>
             <w:tcW w:type="dxa" w:w="1941"/>
@@ -27571,7 +28154,7 @@
                 <w:i w:val="0"/>
                 <w:sz w:val="17"/>
               </w:rPr>
-              <w:t>Twelve live mock-mode captures</w:t>
+              <w:t>Twelve local mock-mode captures</w:t>
             </w:r>
           </w:p>
         </w:tc>
@@ -27603,6 +28186,9 @@
         </w:tc>
       </w:tr>
       <w:tr>
+        <w:trPr>
+          <w:cantSplit w:val="true"/>
+        </w:trPr>
         <w:tc>
           <w:tcPr>
             <w:tcW w:type="dxa" w:w="1941"/>
@@ -27735,6 +28321,9 @@
         </w:tc>
       </w:tr>
       <w:tr>
+        <w:trPr>
+          <w:cantSplit w:val="true"/>
+        </w:trPr>
         <w:tc>
           <w:tcPr>
             <w:tcW w:type="dxa" w:w="1941"/>
@@ -27905,6 +28494,7 @@
       <w:tr>
         <w:trPr>
           <w:tblHeader w:val="true"/>
+          <w:cantSplit w:val="true"/>
         </w:trPr>
         <w:tc>
           <w:tcPr>
@@ -28048,6 +28638,9 @@
         </w:tc>
       </w:tr>
       <w:tr>
+        <w:trPr>
+          <w:cantSplit w:val="true"/>
+        </w:trPr>
         <w:tc>
           <w:tcPr>
             <w:tcW w:type="dxa" w:w="1941"/>
@@ -28199,6 +28792,9 @@
         </w:tc>
       </w:tr>
       <w:tr>
+        <w:trPr>
+          <w:cantSplit w:val="true"/>
+        </w:trPr>
         <w:tc>
           <w:tcPr>
             <w:tcW w:type="dxa" w:w="1941"/>
@@ -28331,6 +28927,9 @@
         </w:tc>
       </w:tr>
       <w:tr>
+        <w:trPr>
+          <w:cantSplit w:val="true"/>
+        </w:trPr>
         <w:tc>
           <w:tcPr>
             <w:tcW w:type="dxa" w:w="1941"/>
@@ -28463,6 +29062,9 @@
         </w:tc>
       </w:tr>
       <w:tr>
+        <w:trPr>
+          <w:cantSplit w:val="true"/>
+        </w:trPr>
         <w:tc>
           <w:tcPr>
             <w:tcW w:type="dxa" w:w="1941"/>
@@ -28595,6 +29197,9 @@
         </w:tc>
       </w:tr>
       <w:tr>
+        <w:trPr>
+          <w:cantSplit w:val="true"/>
+        </w:trPr>
         <w:tc>
           <w:tcPr>
             <w:tcW w:type="dxa" w:w="1941"/>
@@ -28727,6 +29332,9 @@
         </w:tc>
       </w:tr>
       <w:tr>
+        <w:trPr>
+          <w:cantSplit w:val="true"/>
+        </w:trPr>
         <w:tc>
           <w:tcPr>
             <w:tcW w:type="dxa" w:w="1941"/>
@@ -28859,6 +29467,9 @@
         </w:tc>
       </w:tr>
       <w:tr>
+        <w:trPr>
+          <w:cantSplit w:val="true"/>
+        </w:trPr>
         <w:tc>
           <w:tcPr>
             <w:tcW w:type="dxa" w:w="1941"/>
@@ -28991,6 +29602,9 @@
         </w:tc>
       </w:tr>
       <w:tr>
+        <w:trPr>
+          <w:cantSplit w:val="true"/>
+        </w:trPr>
         <w:tc>
           <w:tcPr>
             <w:tcW w:type="dxa" w:w="1941"/>
@@ -29123,6 +29737,9 @@
         </w:tc>
       </w:tr>
       <w:tr>
+        <w:trPr>
+          <w:cantSplit w:val="true"/>
+        </w:trPr>
         <w:tc>
           <w:tcPr>
             <w:tcW w:type="dxa" w:w="1941"/>
@@ -30010,6 +30627,7 @@
       <w:tr>
         <w:trPr>
           <w:tblHeader w:val="true"/>
+          <w:cantSplit w:val="true"/>
         </w:trPr>
         <w:tc>
           <w:tcPr>
@@ -30153,6 +30771,9 @@
         </w:tc>
       </w:tr>
       <w:tr>
+        <w:trPr>
+          <w:cantSplit w:val="true"/>
+        </w:trPr>
         <w:tc>
           <w:tcPr>
             <w:tcW w:type="dxa" w:w="1941"/>
@@ -30295,6 +30916,9 @@
         </w:tc>
       </w:tr>
       <w:tr>
+        <w:trPr>
+          <w:cantSplit w:val="true"/>
+        </w:trPr>
         <w:tc>
           <w:tcPr>
             <w:tcW w:type="dxa" w:w="1941"/>
@@ -30438,6 +31062,9 @@
         </w:tc>
       </w:tr>
       <w:tr>
+        <w:trPr>
+          <w:cantSplit w:val="true"/>
+        </w:trPr>
         <w:tc>
           <w:tcPr>
             <w:tcW w:type="dxa" w:w="1941"/>
@@ -30591,6 +31218,9 @@
         </w:tc>
       </w:tr>
       <w:tr>
+        <w:trPr>
+          <w:cantSplit w:val="true"/>
+        </w:trPr>
         <w:tc>
           <w:tcPr>
             <w:tcW w:type="dxa" w:w="1941"/>
@@ -30725,6 +31355,9 @@
         </w:tc>
       </w:tr>
       <w:tr>
+        <w:trPr>
+          <w:cantSplit w:val="true"/>
+        </w:trPr>
         <w:tc>
           <w:tcPr>
             <w:tcW w:type="dxa" w:w="1941"/>
@@ -30859,6 +31492,9 @@
         </w:tc>
       </w:tr>
       <w:tr>
+        <w:trPr>
+          <w:cantSplit w:val="true"/>
+        </w:trPr>
         <w:tc>
           <w:tcPr>
             <w:tcW w:type="dxa" w:w="1941"/>
@@ -30993,6 +31629,9 @@
         </w:tc>
       </w:tr>
       <w:tr>
+        <w:trPr>
+          <w:cantSplit w:val="true"/>
+        </w:trPr>
         <w:tc>
           <w:tcPr>
             <w:tcW w:type="dxa" w:w="1941"/>
@@ -31126,6 +31765,9 @@
         </w:tc>
       </w:tr>
       <w:tr>
+        <w:trPr>
+          <w:cantSplit w:val="true"/>
+        </w:trPr>
         <w:tc>
           <w:tcPr>
             <w:tcW w:type="dxa" w:w="1941"/>
@@ -31287,7 +31929,7 @@
           <w:i w:val="0"/>
           <w:sz w:val="21"/>
         </w:rPr>
-        <w:t>The twelve product captures were produced from the locally running React interface after exercising the relevant controls. The capture set contains synthetic application references and mock results only. No screenshot should be used as a substitute for API logs, test output, model reports, source review, or independent validation.</w:t>
+        <w:t>The twelve product captures came from one locally run React session. They contain synthetic application references, fixture values, and runtime-generated mock fields. They demonstrate interface state and operator flow. They are not substitutes for API logs, test output, model reports, source review, or independent validation.</w:t>
       </w:r>
     </w:p>
     <w:p>
@@ -31527,6 +32169,7 @@
       <w:tr>
         <w:trPr>
           <w:tblHeader w:val="true"/>
+          <w:cantSplit w:val="true"/>
         </w:trPr>
         <w:tc>
           <w:tcPr>
@@ -31586,6 +32229,9 @@
         </w:tc>
       </w:tr>
       <w:tr>
+        <w:trPr>
+          <w:cantSplit w:val="true"/>
+        </w:trPr>
         <w:tc>
           <w:tcPr>
             <w:tcW w:type="dxa" w:w="4853"/>
@@ -31640,6 +32286,9 @@
         </w:tc>
       </w:tr>
       <w:tr>
+        <w:trPr>
+          <w:cantSplit w:val="true"/>
+        </w:trPr>
         <w:tc>
           <w:tcPr>
             <w:tcW w:type="dxa" w:w="4853"/>
@@ -31694,6 +32343,9 @@
         </w:tc>
       </w:tr>
       <w:tr>
+        <w:trPr>
+          <w:cantSplit w:val="true"/>
+        </w:trPr>
         <w:tc>
           <w:tcPr>
             <w:tcW w:type="dxa" w:w="4853"/>
@@ -31748,6 +32400,9 @@
         </w:tc>
       </w:tr>
       <w:tr>
+        <w:trPr>
+          <w:cantSplit w:val="true"/>
+        </w:trPr>
         <w:tc>
           <w:tcPr>
             <w:tcW w:type="dxa" w:w="4853"/>
@@ -31802,6 +32457,9 @@
         </w:tc>
       </w:tr>
       <w:tr>
+        <w:trPr>
+          <w:cantSplit w:val="true"/>
+        </w:trPr>
         <w:tc>
           <w:tcPr>
             <w:tcW w:type="dxa" w:w="4853"/>
@@ -31856,6 +32514,9 @@
         </w:tc>
       </w:tr>
       <w:tr>
+        <w:trPr>
+          <w:cantSplit w:val="true"/>
+        </w:trPr>
         <w:tc>
           <w:tcPr>
             <w:tcW w:type="dxa" w:w="4853"/>
@@ -31938,7 +32599,7 @@
           <w:i w:val="0"/>
           <w:sz w:val="21"/>
         </w:rPr>
-        <w:t>The appropriate submission claim is: the repository contains a technically coherent, open-source reference implementation for alternative-data credit evaluation with working synthetic-data training, real-time scoring interfaces, baseline explainability, fairness metrics, privacy-aware audit primitives, governance concepts, and an exercised demonstration console. The package also identifies the specific technical, statistical, operational, legal, and governance work required before any production lending use.</w:t>
+        <w:t>A reviewer can reasonably conclude that the repository contains an open-source reference implementation for alternative-data credit evaluation, including synthetic-data training, scoring interfaces, baseline explainability, fairness metrics, privacy-aware audit primitives, governance concepts, and an exercised demonstration console. The same evidence also shows what is unfinished: real-data validation, model convergence and performance work, production security, durable audit controls, legal review, operating evidence, and lender-pilot results.</w:t>
       </w:r>
     </w:p>
     <w:p>
@@ -32440,6 +33101,39 @@
           <w:sz w:val="21"/>
         </w:rPr>
         <w:t>Scoring, explanation, fairness, portfolio-analysis, borrower-rights, outcome, and governance interactions were exercised before twelve interface screenshots were captured.</w:t>
+      </w:r>
+    </w:p>
+    <w:p>
+      <w:pPr>
+        <w:pStyle w:val="ListBullet"/>
+      </w:pPr>
+      <w:r>
+        <w:rPr>
+          <w:rFonts w:ascii="Calibri" w:hAnsi="Calibri"/>
+          <w:b w:val="0"/>
+          <w:i w:val="0"/>
+          <w:sz w:val="21"/>
+        </w:rPr>
+        <w:t xml:space="preserve">The mock adapter uses typed fixtures for most panels, but its scoring path generates score, decision, request-ID, and </w:t>
+      </w:r>
+      <w:r>
+        <w:rPr>
+          <w:rFonts w:ascii="Courier New" w:hAnsi="Courier New"/>
+          <w:b w:val="0"/>
+          <w:i w:val="0"/>
+          <w:color w:val="1B365D"/>
+          <w:sz w:val="18"/>
+        </w:rPr>
+        <w:t>created_at</w:t>
+      </w:r>
+      <w:r>
+        <w:rPr>
+          <w:rFonts w:ascii="Calibri" w:hAnsi="Calibri"/>
+          <w:b w:val="0"/>
+          <w:i w:val="0"/>
+          <w:sz w:val="21"/>
+        </w:rPr>
+        <w:t xml:space="preserve"> values at runtime. The capture set records the exercised session; it is not a deterministic API transcript.</w:t>
       </w:r>
     </w:p>
     <w:p>
@@ -33365,7 +34059,7 @@
           <w:i w:val="0"/>
           <w:sz w:val="21"/>
         </w:rPr>
-        <w:t xml:space="preserve">The SHA-256 values below identify the twelve live mock-mode product captures embedded in Section 9. Verify them from the package root with </w:t>
+        <w:t xml:space="preserve">The SHA-256 values below identify the twelve local mock-mode product captures embedded in Section 9. Verify them from the package root with </w:t>
       </w:r>
       <w:r>
         <w:rPr>

</xml_diff>